<commit_message>
phase 5 done, bug fixes
</commit_message>
<xml_diff>
--- a/documents/Meeting Minutes - 04.docx
+++ b/documents/Meeting Minutes - 04.docx
@@ -40,165 +40,166 @@
           <w:sz w:val="32"/>
           <w:szCs w:val="32"/>
         </w:rPr>
-        <w:t xml:space="preserve">Project </w:t>
-      </w:r>
-      <w:proofErr w:type="gramStart"/>
-      <w:r>
-        <w:rPr>
-          <w:rFonts w:ascii="Times New Roman" w:hAnsi="Times New Roman" w:cs="Times New Roman"/>
-          <w:b/>
-          <w:bCs/>
+        <w:t xml:space="preserve">Project Name </w:t>
+      </w:r>
+      <w:r>
+        <w:rPr>
+          <w:rFonts w:ascii="Times New Roman" w:hAnsi="Times New Roman" w:cs="Times New Roman"/>
           <w:sz w:val="32"/>
           <w:szCs w:val="32"/>
         </w:rPr>
-        <w:t xml:space="preserve">Name </w:t>
-      </w:r>
-      <w:r>
+        <w:t>: OceanGuard – Marine Pollution, Biodiversity and     Coastal Monitioring System</w:t>
+      </w:r>
+    </w:p>
+    <w:p>
+      <w:pPr>
         <w:rPr>
           <w:rFonts w:ascii="Times New Roman" w:hAnsi="Times New Roman" w:cs="Times New Roman"/>
           <w:sz w:val="32"/>
           <w:szCs w:val="32"/>
         </w:rPr>
-        <w:t>:</w:t>
-      </w:r>
-      <w:proofErr w:type="gramEnd"/>
-      <w:r>
-        <w:rPr>
-          <w:rFonts w:ascii="Times New Roman" w:hAnsi="Times New Roman" w:cs="Times New Roman"/>
+      </w:pPr>
+      <w:r>
+        <w:rPr>
+          <w:rFonts w:ascii="Times New Roman" w:hAnsi="Times New Roman" w:cs="Times New Roman"/>
+          <w:b/>
+          <w:bCs/>
           <w:sz w:val="32"/>
           <w:szCs w:val="32"/>
         </w:rPr>
-        <w:t xml:space="preserve"> </w:t>
-      </w:r>
-      <w:proofErr w:type="spellStart"/>
+        <w:t>Meeting no :</w:t>
+      </w:r>
       <w:r>
         <w:rPr>
           <w:rFonts w:ascii="Times New Roman" w:hAnsi="Times New Roman" w:cs="Times New Roman"/>
           <w:sz w:val="32"/>
           <w:szCs w:val="32"/>
         </w:rPr>
-        <w:t>OceanGuard</w:t>
-      </w:r>
-      <w:proofErr w:type="spellEnd"/>
+        <w:t xml:space="preserve"> 0</w:t>
+      </w:r>
       <w:r>
         <w:rPr>
           <w:rFonts w:ascii="Times New Roman" w:hAnsi="Times New Roman" w:cs="Times New Roman"/>
           <w:sz w:val="32"/>
           <w:szCs w:val="32"/>
         </w:rPr>
-        <w:t xml:space="preserve"> – Marine Pollution, Biodiversity and     Coastal </w:t>
-      </w:r>
-      <w:proofErr w:type="spellStart"/>
-      <w:r>
-        <w:rPr>
-          <w:rFonts w:ascii="Times New Roman" w:hAnsi="Times New Roman" w:cs="Times New Roman"/>
+        <w:t>4</w:t>
+      </w:r>
+    </w:p>
+    <w:p>
+      <w:pPr>
+        <w:rPr>
+          <w:rFonts w:ascii="Times New Roman" w:hAnsi="Times New Roman" w:cs="Times New Roman"/>
+          <w:b/>
+          <w:bCs/>
           <w:sz w:val="32"/>
           <w:szCs w:val="32"/>
         </w:rPr>
-        <w:t>Monitioring</w:t>
-      </w:r>
-      <w:proofErr w:type="spellEnd"/>
+      </w:pPr>
+      <w:r>
+        <w:rPr>
+          <w:rFonts w:ascii="Times New Roman" w:hAnsi="Times New Roman" w:cs="Times New Roman"/>
+          <w:b/>
+          <w:bCs/>
+          <w:sz w:val="28"/>
+          <w:szCs w:val="28"/>
+        </w:rPr>
+        <w:t>Team</w:t>
+      </w:r>
       <w:r>
         <w:rPr>
           <w:rFonts w:ascii="Times New Roman" w:hAnsi="Times New Roman" w:cs="Times New Roman"/>
           <w:sz w:val="32"/>
           <w:szCs w:val="32"/>
         </w:rPr>
-        <w:t xml:space="preserve"> System</w:t>
+        <w:t xml:space="preserve">: </w:t>
+      </w:r>
+      <w:r>
+        <w:rPr>
+          <w:rFonts w:ascii="Times New Roman" w:hAnsi="Times New Roman" w:cs="Times New Roman"/>
+          <w:sz w:val="28"/>
+          <w:szCs w:val="28"/>
+        </w:rPr>
+        <w:t>EcoVision Software</w:t>
       </w:r>
     </w:p>
     <w:p>
       <w:pPr>
         <w:rPr>
           <w:rFonts w:ascii="Times New Roman" w:hAnsi="Times New Roman" w:cs="Times New Roman"/>
-          <w:sz w:val="32"/>
-          <w:szCs w:val="32"/>
-        </w:rPr>
-      </w:pPr>
-      <w:r>
-        <w:rPr>
-          <w:rFonts w:ascii="Times New Roman" w:hAnsi="Times New Roman" w:cs="Times New Roman"/>
-          <w:b/>
-          <w:bCs/>
-          <w:sz w:val="32"/>
-          <w:szCs w:val="32"/>
-        </w:rPr>
-        <w:t xml:space="preserve">Meeting </w:t>
-      </w:r>
-      <w:proofErr w:type="gramStart"/>
-      <w:r>
-        <w:rPr>
-          <w:rFonts w:ascii="Times New Roman" w:hAnsi="Times New Roman" w:cs="Times New Roman"/>
-          <w:b/>
-          <w:bCs/>
-          <w:sz w:val="32"/>
-          <w:szCs w:val="32"/>
-        </w:rPr>
-        <w:t>no :</w:t>
-      </w:r>
-      <w:proofErr w:type="gramEnd"/>
-      <w:r>
-        <w:rPr>
-          <w:rFonts w:ascii="Times New Roman" w:hAnsi="Times New Roman" w:cs="Times New Roman"/>
-          <w:sz w:val="32"/>
-          <w:szCs w:val="32"/>
-        </w:rPr>
-        <w:t xml:space="preserve"> 0</w:t>
-      </w:r>
-      <w:r>
-        <w:rPr>
-          <w:rFonts w:ascii="Times New Roman" w:hAnsi="Times New Roman" w:cs="Times New Roman"/>
-          <w:sz w:val="32"/>
-          <w:szCs w:val="32"/>
-        </w:rPr>
-        <w:t>4</w:t>
+          <w:sz w:val="28"/>
+          <w:szCs w:val="28"/>
+        </w:rPr>
+      </w:pPr>
+      <w:r>
+        <w:rPr>
+          <w:rFonts w:ascii="Times New Roman" w:hAnsi="Times New Roman" w:cs="Times New Roman"/>
+          <w:b/>
+          <w:bCs/>
+          <w:sz w:val="28"/>
+          <w:szCs w:val="28"/>
+        </w:rPr>
+        <w:t>Date</w:t>
+      </w:r>
+      <w:r>
+        <w:rPr>
+          <w:rFonts w:ascii="Times New Roman" w:hAnsi="Times New Roman" w:cs="Times New Roman"/>
+          <w:sz w:val="28"/>
+          <w:szCs w:val="28"/>
+        </w:rPr>
+        <w:t xml:space="preserve">:  </w:t>
+      </w:r>
+      <w:r>
+        <w:rPr>
+          <w:rFonts w:ascii="Times New Roman" w:hAnsi="Times New Roman" w:cs="Times New Roman"/>
+          <w:sz w:val="28"/>
+          <w:szCs w:val="28"/>
+        </w:rPr>
+        <w:t>11</w:t>
+      </w:r>
+      <w:r>
+        <w:rPr>
+          <w:rFonts w:ascii="Times New Roman" w:hAnsi="Times New Roman" w:cs="Times New Roman"/>
+          <w:sz w:val="28"/>
+          <w:szCs w:val="28"/>
+          <w:vertAlign w:val="superscript"/>
+        </w:rPr>
+        <w:t>th</w:t>
+      </w:r>
+      <w:r>
+        <w:rPr>
+          <w:rFonts w:ascii="Times New Roman" w:hAnsi="Times New Roman" w:cs="Times New Roman"/>
+          <w:sz w:val="28"/>
+          <w:szCs w:val="28"/>
+        </w:rPr>
+        <w:t xml:space="preserve"> Sept,2026</w:t>
       </w:r>
     </w:p>
     <w:p>
       <w:pPr>
         <w:rPr>
           <w:rFonts w:ascii="Times New Roman" w:hAnsi="Times New Roman" w:cs="Times New Roman"/>
-          <w:b/>
-          <w:bCs/>
-          <w:sz w:val="32"/>
-          <w:szCs w:val="32"/>
-        </w:rPr>
-      </w:pPr>
-      <w:r>
-        <w:rPr>
-          <w:rFonts w:ascii="Times New Roman" w:hAnsi="Times New Roman" w:cs="Times New Roman"/>
-          <w:b/>
-          <w:bCs/>
-          <w:sz w:val="28"/>
-          <w:szCs w:val="28"/>
-        </w:rPr>
-        <w:t>Team</w:t>
-      </w:r>
-      <w:r>
-        <w:rPr>
-          <w:rFonts w:ascii="Times New Roman" w:hAnsi="Times New Roman" w:cs="Times New Roman"/>
-          <w:sz w:val="32"/>
-          <w:szCs w:val="32"/>
-        </w:rPr>
-        <w:t xml:space="preserve">: </w:t>
-      </w:r>
-      <w:proofErr w:type="spellStart"/>
-      <w:r>
-        <w:rPr>
-          <w:rFonts w:ascii="Times New Roman" w:hAnsi="Times New Roman" w:cs="Times New Roman"/>
-          <w:sz w:val="28"/>
-          <w:szCs w:val="28"/>
-        </w:rPr>
-        <w:t>EcoVision</w:t>
-      </w:r>
-      <w:proofErr w:type="spellEnd"/>
-      <w:r>
-        <w:rPr>
-          <w:rFonts w:ascii="Times New Roman" w:hAnsi="Times New Roman" w:cs="Times New Roman"/>
-          <w:sz w:val="28"/>
-          <w:szCs w:val="28"/>
-        </w:rPr>
-        <w:t xml:space="preserve"> Software</w:t>
+          <w:sz w:val="28"/>
+          <w:szCs w:val="28"/>
+        </w:rPr>
+      </w:pPr>
+      <w:r>
+        <w:rPr>
+          <w:rFonts w:ascii="Times New Roman" w:hAnsi="Times New Roman" w:cs="Times New Roman"/>
+          <w:b/>
+          <w:bCs/>
+          <w:sz w:val="28"/>
+          <w:szCs w:val="28"/>
+        </w:rPr>
+        <w:t xml:space="preserve">Venue: </w:t>
+      </w:r>
+      <w:r>
+        <w:rPr>
+          <w:rFonts w:ascii="Times New Roman" w:hAnsi="Times New Roman" w:cs="Times New Roman"/>
+          <w:sz w:val="28"/>
+          <w:szCs w:val="28"/>
+        </w:rPr>
+        <w:t>Meeting Room</w:t>
       </w:r>
     </w:p>
     <w:p>
@@ -217,40 +218,15 @@
           <w:sz w:val="28"/>
           <w:szCs w:val="28"/>
         </w:rPr>
-        <w:t>Date</w:t>
-      </w:r>
-      <w:r>
-        <w:rPr>
-          <w:rFonts w:ascii="Times New Roman" w:hAnsi="Times New Roman" w:cs="Times New Roman"/>
-          <w:sz w:val="28"/>
-          <w:szCs w:val="28"/>
-        </w:rPr>
-        <w:t xml:space="preserve">:  </w:t>
-      </w:r>
-      <w:r>
-        <w:rPr>
-          <w:rFonts w:ascii="Times New Roman" w:hAnsi="Times New Roman" w:cs="Times New Roman"/>
-          <w:sz w:val="28"/>
-          <w:szCs w:val="28"/>
-        </w:rPr>
-        <w:t>11</w:t>
-      </w:r>
-      <w:r>
-        <w:rPr>
-          <w:rFonts w:ascii="Times New Roman" w:hAnsi="Times New Roman" w:cs="Times New Roman"/>
-          <w:sz w:val="28"/>
-          <w:szCs w:val="28"/>
-          <w:vertAlign w:val="superscript"/>
-        </w:rPr>
-        <w:t>th</w:t>
-      </w:r>
-      <w:r>
-        <w:rPr>
-          <w:rFonts w:ascii="Times New Roman" w:hAnsi="Times New Roman" w:cs="Times New Roman"/>
-          <w:sz w:val="28"/>
-          <w:szCs w:val="28"/>
-        </w:rPr>
-        <w:t xml:space="preserve"> Sept,2026</w:t>
+        <w:t>Present</w:t>
+      </w:r>
+      <w:r>
+        <w:rPr>
+          <w:rFonts w:ascii="Times New Roman" w:hAnsi="Times New Roman" w:cs="Times New Roman"/>
+          <w:sz w:val="28"/>
+          <w:szCs w:val="28"/>
+        </w:rPr>
+        <w:t xml:space="preserve"> : Hrishikesh Patel, Ruzhi Deng, Ganesh Khatri, Shailesh Shrestha</w:t>
       </w:r>
     </w:p>
     <w:p>
@@ -269,88 +245,6 @@
           <w:sz w:val="28"/>
           <w:szCs w:val="28"/>
         </w:rPr>
-        <w:t xml:space="preserve">Venue: </w:t>
-      </w:r>
-      <w:r>
-        <w:rPr>
-          <w:rFonts w:ascii="Times New Roman" w:hAnsi="Times New Roman" w:cs="Times New Roman"/>
-          <w:sz w:val="28"/>
-          <w:szCs w:val="28"/>
-        </w:rPr>
-        <w:t>Meeting Room</w:t>
-      </w:r>
-    </w:p>
-    <w:p>
-      <w:pPr>
-        <w:rPr>
-          <w:rFonts w:ascii="Times New Roman" w:hAnsi="Times New Roman" w:cs="Times New Roman"/>
-          <w:sz w:val="28"/>
-          <w:szCs w:val="28"/>
-        </w:rPr>
-      </w:pPr>
-      <w:proofErr w:type="gramStart"/>
-      <w:r>
-        <w:rPr>
-          <w:rFonts w:ascii="Times New Roman" w:hAnsi="Times New Roman" w:cs="Times New Roman"/>
-          <w:b/>
-          <w:bCs/>
-          <w:sz w:val="28"/>
-          <w:szCs w:val="28"/>
-        </w:rPr>
-        <w:t>Present</w:t>
-      </w:r>
-      <w:r>
-        <w:rPr>
-          <w:rFonts w:ascii="Times New Roman" w:hAnsi="Times New Roman" w:cs="Times New Roman"/>
-          <w:sz w:val="28"/>
-          <w:szCs w:val="28"/>
-        </w:rPr>
-        <w:t xml:space="preserve"> :</w:t>
-      </w:r>
-      <w:proofErr w:type="gramEnd"/>
-      <w:r>
-        <w:rPr>
-          <w:rFonts w:ascii="Times New Roman" w:hAnsi="Times New Roman" w:cs="Times New Roman"/>
-          <w:sz w:val="28"/>
-          <w:szCs w:val="28"/>
-        </w:rPr>
-        <w:t xml:space="preserve"> Hrishikesh Patel, </w:t>
-      </w:r>
-      <w:proofErr w:type="spellStart"/>
-      <w:r>
-        <w:rPr>
-          <w:rFonts w:ascii="Times New Roman" w:hAnsi="Times New Roman" w:cs="Times New Roman"/>
-          <w:sz w:val="28"/>
-          <w:szCs w:val="28"/>
-        </w:rPr>
-        <w:t>Ruzhi</w:t>
-      </w:r>
-      <w:proofErr w:type="spellEnd"/>
-      <w:r>
-        <w:rPr>
-          <w:rFonts w:ascii="Times New Roman" w:hAnsi="Times New Roman" w:cs="Times New Roman"/>
-          <w:sz w:val="28"/>
-          <w:szCs w:val="28"/>
-        </w:rPr>
-        <w:t xml:space="preserve"> Deng, Ganesh Khatri, Shailesh Shrestha</w:t>
-      </w:r>
-    </w:p>
-    <w:p>
-      <w:pPr>
-        <w:rPr>
-          <w:rFonts w:ascii="Times New Roman" w:hAnsi="Times New Roman" w:cs="Times New Roman"/>
-          <w:sz w:val="28"/>
-          <w:szCs w:val="28"/>
-        </w:rPr>
-      </w:pPr>
-      <w:r>
-        <w:rPr>
-          <w:rFonts w:ascii="Times New Roman" w:hAnsi="Times New Roman" w:cs="Times New Roman"/>
-          <w:b/>
-          <w:bCs/>
-          <w:sz w:val="28"/>
-          <w:szCs w:val="28"/>
-        </w:rPr>
         <w:t>Minutes</w:t>
       </w:r>
       <w:r>
@@ -361,7 +255,6 @@
         </w:rPr>
         <w:t xml:space="preserve"> </w:t>
       </w:r>
-      <w:proofErr w:type="gramStart"/>
       <w:r>
         <w:rPr>
           <w:rFonts w:ascii="Times New Roman" w:hAnsi="Times New Roman" w:cs="Times New Roman"/>
@@ -378,16 +271,7 @@
           <w:sz w:val="28"/>
           <w:szCs w:val="28"/>
         </w:rPr>
-        <w:t xml:space="preserve"> :</w:t>
-      </w:r>
-      <w:proofErr w:type="gramEnd"/>
-      <w:r>
-        <w:rPr>
-          <w:rFonts w:ascii="Times New Roman" w:hAnsi="Times New Roman" w:cs="Times New Roman"/>
-          <w:sz w:val="28"/>
-          <w:szCs w:val="28"/>
-        </w:rPr>
-        <w:t xml:space="preserve"> Shailesh Shrestha</w:t>
+        <w:t xml:space="preserve"> : Shailesh Shrestha</w:t>
       </w:r>
     </w:p>
     <w:p>
@@ -465,7 +349,15 @@
           <w:sz w:val="28"/>
           <w:szCs w:val="28"/>
         </w:rPr>
-        <w:t>To implement the process of collecting and verifying environmental information.</w:t>
+        <w:t xml:space="preserve">To implement the </w:t>
+      </w:r>
+      <w:r>
+        <w:rPr>
+          <w:rFonts w:ascii="Times New Roman" w:hAnsi="Times New Roman" w:cs="Times New Roman"/>
+          <w:sz w:val="28"/>
+          <w:szCs w:val="28"/>
+        </w:rPr>
+        <w:t>remaining sub-functionalities under different user perspectives (Management system, Participation system)</w:t>
       </w:r>
     </w:p>
     <w:p>
@@ -489,7 +381,15 @@
           <w:sz w:val="28"/>
           <w:szCs w:val="28"/>
         </w:rPr>
-        <w:t>To access and visualize the collected and verified information.</w:t>
+        <w:t xml:space="preserve">To </w:t>
+      </w:r>
+      <w:r>
+        <w:rPr>
+          <w:rFonts w:ascii="Times New Roman" w:hAnsi="Times New Roman" w:cs="Times New Roman"/>
+          <w:sz w:val="28"/>
+          <w:szCs w:val="28"/>
+        </w:rPr>
+        <w:t>expand and implement reporting system,</w:t>
       </w:r>
       <w:r>
         <w:rPr>
@@ -559,7 +459,6 @@
                 <w:szCs w:val="28"/>
               </w:rPr>
             </w:pPr>
-            <w:proofErr w:type="gramStart"/>
             <w:r>
               <w:rPr>
                 <w:rFonts w:ascii="Times New Roman" w:hAnsi="Times New Roman" w:cs="Times New Roman"/>
@@ -570,7 +469,6 @@
               </w:rPr>
               <w:t>S.N</w:t>
             </w:r>
-            <w:proofErr w:type="gramEnd"/>
           </w:p>
         </w:tc>
         <w:tc>
@@ -919,15 +817,7 @@
                 <w:sz w:val="28"/>
                 <w:szCs w:val="28"/>
               </w:rPr>
-              <w:t>The team implemented a participation mechanism that allows Community Members to browse available cleanup campaigns and join environmental activities.</w:t>
-            </w:r>
-            <w:r>
-              <w:rPr>
-                <w:rFonts w:ascii="Times New Roman" w:hAnsi="Times New Roman" w:cs="Times New Roman"/>
-                <w:sz w:val="28"/>
-                <w:szCs w:val="28"/>
-              </w:rPr>
-              <w:t xml:space="preserve"> A participation database was also implemented</w:t>
+              <w:t>The team implemented a participation mechanism that allows Community Members to browse available cleanup campaigns and join environmental activities. A participation database was also implemented</w:t>
             </w:r>
           </w:p>
         </w:tc>
@@ -999,23 +889,7 @@
                 <w:sz w:val="28"/>
                 <w:szCs w:val="28"/>
               </w:rPr>
-              <w:t xml:space="preserve">The team </w:t>
-            </w:r>
-            <w:r>
-              <w:rPr>
-                <w:rFonts w:ascii="Times New Roman" w:hAnsi="Times New Roman" w:cs="Times New Roman"/>
-                <w:sz w:val="28"/>
-                <w:szCs w:val="28"/>
-              </w:rPr>
-              <w:t xml:space="preserve">discussed a functionality </w:t>
-            </w:r>
-            <w:r>
-              <w:rPr>
-                <w:rFonts w:ascii="Times New Roman" w:hAnsi="Times New Roman" w:cs="Times New Roman"/>
-                <w:sz w:val="28"/>
-                <w:szCs w:val="28"/>
-              </w:rPr>
-              <w:t>to record the outcomes of completed cleanup campaigns.</w:t>
+              <w:t>The team discussed a functionality to record the outcomes of completed cleanup campaigns.</w:t>
             </w:r>
           </w:p>
         </w:tc>
@@ -1151,7 +1025,6 @@
                 <w:szCs w:val="28"/>
               </w:rPr>
             </w:pPr>
-            <w:proofErr w:type="gramStart"/>
             <w:r>
               <w:rPr>
                 <w:b/>
@@ -1161,7 +1034,6 @@
               </w:rPr>
               <w:t>S.N</w:t>
             </w:r>
-            <w:proofErr w:type="gramEnd"/>
           </w:p>
         </w:tc>
         <w:tc>
@@ -1504,23 +1376,7 @@
                 <w:sz w:val="28"/>
                 <w:szCs w:val="28"/>
               </w:rPr>
-              <w:t xml:space="preserve">Continue using </w:t>
-            </w:r>
-            <w:proofErr w:type="gramStart"/>
-            <w:r>
-              <w:rPr>
-                <w:sz w:val="28"/>
-                <w:szCs w:val="28"/>
-              </w:rPr>
-              <w:t>role based</w:t>
-            </w:r>
-            <w:proofErr w:type="gramEnd"/>
-            <w:r>
-              <w:rPr>
-                <w:sz w:val="28"/>
-                <w:szCs w:val="28"/>
-              </w:rPr>
-              <w:t xml:space="preserve"> access control to restrict unwanted features based on user roles.</w:t>
+              <w:t>Continue using role based access control to restrict unwanted features based on user roles.</w:t>
             </w:r>
           </w:p>
         </w:tc>

</xml_diff>